<commit_message>
Fincut #268145 : signature manuscrite et lieu Paris
Corrige le lieu de l'attestation GLS (Paris) et ajoute une signature
manuscrite, comme demandé par le SAV Fincut avant enquête GLS.

Co-authored-by: dhaccoun <dhaccoun@users.noreply.github.com>
</commit_message>
<xml_diff>
--- a/fincut/GLS_ATTESTATION_remplie_David_Haccoun.docx
+++ b/fincut/GLS_ATTESTATION_remplie_David_Haccoun.docx
@@ -974,7 +974,7 @@
           <ns0:szCs ns0:val="20"/>
           <ns0:rtl ns0:val="0"/>
         </ns0:rPr>
-        <ns0:t>A : Bal Harbour</ns0:t>
+        <ns0:t>A : Paris</ns0:t>
       </ns0:r>
       <ns0:r ns0:rsidDel="00000000" ns0:rsidR="00000000" ns0:rsidRPr="00000000">
         <ns0:rPr>
@@ -1008,7 +1008,50 @@
           <ns0:szCs ns0:val="20"/>
           <ns0:rtl ns0:val="0"/>
         </ns0:rPr>
-        <ns0:t>Signature : David HACCOUN</ns0:t>
+        <ns0:t>Signature :</ns0:t>
+      </ns0:r>
+      <ns0:r ns0:rsidDel="00000000" ns0:rsidR="00000000" ns0:rsidRPr="00000000">
+        <ns0:rPr>
+          <ns0:rFonts ns0:ascii="Verdana" ns0:cs="Verdana" ns0:eastAsia="Verdana" ns0:hAnsi="Verdana"/>
+          <ns0:sz ns0:val="20"/>
+          <ns0:szCs ns0:val="20"/>
+          <ns0:rtl ns0:val="0"/>
+        </ns0:rPr>
+        <ns0:drawing>
+          <ns3:inline distT="0" distB="0" distL="0" distR="0">
+            <ns3:extent cx="2011680" cy="672655"/>
+            <ns3:effectExtent l="0" t="0" r="0" b="0"/>
+            <ns3:docPr id="20" name="Signature David Haccoun"/>
+            <ns3:cNvGraphicFramePr>
+              <ns4:graphicFrameLocks noChangeAspect="1"/>
+            </ns3:cNvGraphicFramePr>
+            <ns4:graphic>
+              <ns4:graphicData uri="http://schemas.openxmlformats.org/drawingml/2006/picture">
+                <ns6:pic>
+                  <ns6:nvPicPr>
+                    <ns6:cNvPr id="21" name="signature_david_haccoun.png"/>
+                    <ns6:cNvPicPr/>
+                  </ns6:nvPicPr>
+                  <ns6:blipFill>
+                    <ns4:blip ns7:embed="rId10"/>
+                    <ns4:stretch>
+                      <ns4:fillRect/>
+                    </ns4:stretch>
+                  </ns6:blipFill>
+                  <ns6:spPr>
+                    <ns4:xfrm>
+                      <ns4:off x="0" y="0"/>
+                      <ns4:ext cx="2011680" cy="672655"/>
+                    </ns4:xfrm>
+                    <ns4:prstGeom prst="rect">
+                      <ns4:avLst/>
+                    </ns4:prstGeom>
+                  </ns6:spPr>
+                </ns6:pic>
+              </ns4:graphicData>
+            </ns4:graphic>
+          </ns3:inline>
+        </ns0:drawing>
       </ns0:r>
     </ns0:p>
     <ns0:p ns0:rsidR="00000000" ns0:rsidDel="00000000" ns0:rsidP="00000000" ns0:rsidRDefault="00000000" ns0:rsidRPr="00000000" ns1:paraId="00000010">

</xml_diff>